<commit_message>
game design fixed practic 3
</commit_message>
<xml_diff>
--- a/Sem5/GameDesign/Отчеты/3_Комисарик_МА_ИКБО-20-23.docx
+++ b/Sem5/GameDesign/Отчеты/3_Комисарик_МА_ИКБО-20-23.docx
@@ -430,10 +430,7 @@
       </w:pPr>
       <w:r>
         <w:lastRenderedPageBreak/>
-        <w:t>Расходн</w:t>
-      </w:r>
-      <w:r>
-        <w:t>ые предметы (расходники)</w:t>
+        <w:t>Бомбы</w:t>
       </w:r>
     </w:p>
     <w:p>
@@ -441,10 +438,19 @@
         <w:pStyle w:val="a3"/>
       </w:pPr>
       <w:r>
-        <w:t>Расходники делятся на монеты, бомбы</w:t>
-      </w:r>
-      <w:r>
-        <w:t>, ключи, карты, пилюли и руны. Расходники подбираются при касании их персонажем. Расходники можно использовать или тратить, после чего расходник пропадет из инвентаря.</w:t>
+        <w:t>Бомбы можно ставить для взрыва разрушаемых блоков и проходов в секретную комнату, а также для нанесения урона.</w:t>
+      </w:r>
+      <w:r>
+        <w:t xml:space="preserve"> В секретных комнатах есть шанс появления активного</w:t>
+      </w:r>
+      <w:r>
+        <w:t>/</w:t>
+      </w:r>
+      <w:r>
+        <w:t>пассивного предмета.</w:t>
+      </w:r>
+      <w:r>
+        <w:t xml:space="preserve"> Бомбы подбираются при касании их персонажем, после чего собранное количество бомб прибавляется к счетчику бомб на экране. Бомбы можно найти в различных местах, в их числе лут с зачистки комнаты, сундуки и магазин.</w:t>
       </w:r>
     </w:p>
     <w:p>
@@ -463,7 +469,25 @@
         <w:pStyle w:val="a3"/>
       </w:pPr>
       <w:r>
-        <w:t>Магазин – специальная комната, в которой за монеты можно покупать различные предметы. В комнате располагается несколько предметов, под которыми располагается число – стоимость предмета. При касании персонажем предмета предмет купится.</w:t>
+        <w:t>Магазин – специальная комната, в которой за монеты можно покупать различные предметы.</w:t>
+      </w:r>
+      <w:r>
+        <w:t xml:space="preserve"> Монеты – расходный предмет, который может являться лутом с зачистки комнаты, выпасть с сундуков, подбирается при соприкосновении и добавляется к счетчику на экране, причем подбираемые монеты могут быть разного номинала – 1, 5, 10 монет.</w:t>
+      </w:r>
+      <w:r>
+        <w:t xml:space="preserve"> В комнате</w:t>
+      </w:r>
+      <w:r>
+        <w:t xml:space="preserve"> магазина</w:t>
+      </w:r>
+      <w:r>
+        <w:t xml:space="preserve"> располагается несколько предметов, под которыми располагается число – стоимость предмета. При касании персонажем предмета предмет купится</w:t>
+      </w:r>
+      <w:r>
+        <w:t>, забрав монеты</w:t>
+      </w:r>
+      <w:r>
+        <w:t>.</w:t>
       </w:r>
     </w:p>
     <w:p>
@@ -474,7 +498,7 @@
         </w:rPr>
       </w:pPr>
       <w:r>
-        <w:t>Этажи</w:t>
+        <w:t>Зеркальный этаж</w:t>
       </w:r>
     </w:p>
     <w:p>
@@ -482,31 +506,16 @@
         <w:pStyle w:val="a3"/>
       </w:pPr>
       <w:r>
-        <w:t>Забег разделяется на несколько этажей. Каждый этаж в забеге состоит из случайно выбранных</w:t>
-      </w:r>
-      <w:r>
-        <w:t xml:space="preserve"> соединенных друг с другом</w:t>
-      </w:r>
-      <w:r>
-        <w:t xml:space="preserve"> комнат</w:t>
-      </w:r>
-      <w:r>
-        <w:t>, обязательна комната с боссом</w:t>
-      </w:r>
-      <w:r>
-        <w:t xml:space="preserve">. Каждый этаж имеет несколько вариаций, </w:t>
-      </w:r>
-      <w:r>
-        <w:t xml:space="preserve">каждая из которых </w:t>
-      </w:r>
-      <w:r>
-        <w:t>имее</w:t>
-      </w:r>
-      <w:r>
-        <w:t>т</w:t>
-      </w:r>
-      <w:r>
-        <w:t xml:space="preserve"> свою отличную от других стилистику и врагов.</w:t>
+        <w:t>В зеркальный этаж можно попасть на 2 и 3 этажах альтернативного пути, пройдя через зеркало, потрогав белый костер. Белый костер дает полет, но персонаж умирает при получении 2 ударов в каждой комнате (при перезаходе в комнату восстанавливается до 2 ударов). На зеркальном этаже отсутствуют все предметы, кроме ножа в сокровищнице, необходимого для получения концовки</w:t>
+      </w:r>
+      <w:r>
+        <w:t>, враги и расположение комнат остаются теми же</w:t>
+      </w:r>
+      <w:r>
+        <w:t xml:space="preserve">. Также за убийство босса в </w:t>
+      </w:r>
+      <w:r>
+        <w:t>конце этажа дается предмет из пула комнаты босса.</w:t>
       </w:r>
     </w:p>
     <w:p>
@@ -555,6 +564,7 @@
         <w:pStyle w:val="a1"/>
       </w:pPr>
       <w:r>
+        <w:lastRenderedPageBreak/>
         <w:t>Уклонение от врагов и их снарядов</w:t>
       </w:r>
     </w:p>
@@ -643,7 +653,6 @@
         <w:pStyle w:val="a1"/>
       </w:pPr>
       <w:r>
-        <w:lastRenderedPageBreak/>
         <w:t>Активные предметы</w:t>
       </w:r>
       <w:r>
@@ -670,7 +679,7 @@
         <w:pStyle w:val="a1"/>
       </w:pPr>
       <w:r>
-        <w:t>Расходники</w:t>
+        <w:t>Бомбы</w:t>
       </w:r>
       <w:r>
         <w:t>:</w:t>
@@ -679,41 +688,53 @@
         <w:t xml:space="preserve"> </w:t>
       </w:r>
       <w:r>
-        <w:t>р</w:t>
+        <w:t>дать игроку дополнительный способ нанесения урона, независимый от пассивных предметов, разнообразить забеги, дать игроку дополнительную возможность получить активный</w:t>
+      </w:r>
+      <w:r>
+        <w:t>/</w:t>
+      </w:r>
+      <w:r>
+        <w:t>пассивный предмет (из секретной комнаты).</w:t>
+      </w:r>
+    </w:p>
+    <w:p>
+      <w:pPr>
+        <w:pStyle w:val="a1"/>
+      </w:pPr>
+      <w:r>
+        <w:t>Магазин</w:t>
+      </w:r>
+      <w:r>
+        <w:t>: разнообразить забеги, повысить реиграбельность,</w:t>
+      </w:r>
+      <w:r>
+        <w:t xml:space="preserve"> дать игроку дополнительный способ получения предметов</w:t>
+      </w:r>
+      <w:r>
+        <w:t>, привлечь накопителей</w:t>
+      </w:r>
+      <w:r>
+        <w:t>.</w:t>
+      </w:r>
+    </w:p>
+    <w:p>
+      <w:pPr>
+        <w:pStyle w:val="a1"/>
+      </w:pPr>
+      <w:r>
+        <w:t>Зеркальный этаж</w:t>
+      </w:r>
+      <w:r>
+        <w:t>: р</w:t>
       </w:r>
       <w:r>
         <w:t>азнообразить забеги, повысить реиграбельность</w:t>
       </w:r>
       <w:r>
-        <w:t>, повысить сложность.</w:t>
-      </w:r>
-    </w:p>
-    <w:p>
-      <w:pPr>
-        <w:pStyle w:val="a1"/>
-      </w:pPr>
-      <w:r>
-        <w:t>Магазин</w:t>
-      </w:r>
-      <w:r>
-        <w:t>: разнообразить забеги, повысить реиграбельность,</w:t>
-      </w:r>
-      <w:r>
-        <w:t xml:space="preserve"> дать игроку дополнительный способ получения предметов.</w:t>
-      </w:r>
-    </w:p>
-    <w:p>
-      <w:pPr>
-        <w:pStyle w:val="a1"/>
-      </w:pPr>
-      <w:r>
-        <w:t>Этажи</w:t>
-      </w:r>
-      <w:r>
-        <w:t>: р</w:t>
-      </w:r>
-      <w:r>
-        <w:t>азнообразить забеги, повысить реиграбельность.</w:t>
+        <w:t>, дать возможность получить пассивный предмет за зачистку этажа с ограниченным хп, усложнить получение концовки</w:t>
+      </w:r>
+      <w:r>
+        <w:t>.</w:t>
       </w:r>
     </w:p>
     <w:p>
@@ -775,6 +796,7 @@
         <w:pStyle w:val="a3"/>
       </w:pPr>
       <w:r>
+        <w:lastRenderedPageBreak/>
         <w:t>Игроки смогут объединяться в группы, в которых будет общий чат. За каждой группой ведется статистика забегов, отображающаяся в общей таблице лидеров.</w:t>
       </w:r>
       <w:r>
@@ -867,7 +889,6 @@
         <w:pStyle w:val="a3"/>
       </w:pPr>
       <w:r>
-        <w:lastRenderedPageBreak/>
         <w:t xml:space="preserve">Если открыта панель эмоутов, выбран какой-то из открытых игроком эмоутов и игрок нажимает кнопку </w:t>
       </w:r>
       <w:r>

</xml_diff>